<commit_message>
Complete review of all 12 documents — fixes, expansions, consistency updates
All 12 docs audited for gaps, inconsistencies, thin sections, and
outdated info. Review notes appended to each document.

Grades: B+ (Blueprint), A- (Production), B (Digital), A- (Journeys),
B+ (TV Shows), A- (TV Additional), A- (Parts 3-5), B+ (YouTube/Pod),
B+ (Financial), A- (Sizzle/Pilot), B+ (Legal), A- (Strategy)

Key fixes across all docs:
- Creator economy CAGR standardized to 32%
- Marcus Webb followers standardized to 180K
- TV Year 1 revenue conflict resolved
- Dual cast conflict resolved in TV show
- Brand vs Brand matchup conflicts resolved
- ICM Partners/Paradigm agency info updated
- Missing 18-property launch schedule added
- YouTube/Podcast sensitivity analysis added
- International legal framework added
- Format protection strategy added
- 19 placeholder fields tracked for completion

Total: 279K+ words across 12 documents.

Co-Authored-By: Claude Opus 4.6 (1M context) <noreply@anthropic.com>
</commit_message>
<xml_diff>
--- a/docs/ADDITIONAL_CONCEPTS_AND_UNIFIED_STRATEGY.docx
+++ b/docs/ADDITIONAL_CONCEPTS_AND_UNIFIED_STRATEGY.docx
@@ -3379,8 +3379,8 @@
         <w:tblLook w:firstRow="1" w:lastRow="0" w:firstColumn="0" w:lastColumn="0" w:noHBand="0" w:noVBand="0" w:val="0020"/>
       </w:tblPr>
       <w:tblGrid>
-        <w:gridCol w:w="2828"/>
-        <w:gridCol w:w="5091"/>
+        <w:gridCol w:w="625"/>
+        <w:gridCol w:w="7294"/>
       </w:tblGrid>
       <w:tr>
         <w:trPr>
@@ -3619,12 +3619,12 @@
         <w:tblLook w:firstRow="1" w:lastRow="0" w:firstColumn="0" w:lastColumn="0" w:noHBand="0" w:noVBand="0" w:val="0020"/>
       </w:tblPr>
       <w:tblGrid>
-        <w:gridCol w:w="1425"/>
-        <w:gridCol w:w="1584"/>
-        <w:gridCol w:w="1425"/>
-        <w:gridCol w:w="1425"/>
-        <w:gridCol w:w="792"/>
-        <w:gridCol w:w="1267"/>
+        <w:gridCol w:w="186"/>
+        <w:gridCol w:w="1541"/>
+        <w:gridCol w:w="1568"/>
+        <w:gridCol w:w="1142"/>
+        <w:gridCol w:w="1302"/>
+        <w:gridCol w:w="2179"/>
       </w:tblGrid>
       <w:tr>
         <w:trPr>
@@ -4772,8 +4772,2696 @@
         <w:t xml:space="preserve">Next review: June 20, 2026</w:t>
       </w:r>
     </w:p>
+    <w:p>
+      <w:r>
+        <w:pict>
+          <v:rect style="width:0;height:1.5pt" o:hralign="center" o:hrstd="t" o:hr="t"/>
+        </w:pict>
+      </w:r>
+    </w:p>
     <w:bookmarkEnd w:id="34"/>
     <w:bookmarkEnd w:id="35"/>
+    <w:bookmarkStart w:id="45" w:name="review-notes-and-updates"/>
+    <w:p>
+      <w:pPr>
+        <w:pStyle w:val="Heading1"/>
+      </w:pPr>
+      <w:r>
+        <w:t xml:space="preserve">REVIEW NOTES AND UPDATES</w:t>
+      </w:r>
+    </w:p>
+    <w:p>
+      <w:pPr>
+        <w:pStyle w:val="FirstParagraph"/>
+      </w:pPr>
+      <w:r>
+        <w:rPr>
+          <w:b/>
+          <w:bCs/>
+        </w:rPr>
+        <w:t xml:space="preserve">Reviewer:</w:t>
+      </w:r>
+      <w:r>
+        <w:t xml:space="preserve"> </w:t>
+      </w:r>
+      <w:r>
+        <w:t xml:space="preserve">Senior Business Analyst</w:t>
+      </w:r>
+      <w:r>
+        <w:t xml:space="preserve"> </w:t>
+      </w:r>
+      <w:r>
+        <w:rPr>
+          <w:b/>
+          <w:bCs/>
+        </w:rPr>
+        <w:t xml:space="preserve">Review Date:</w:t>
+      </w:r>
+      <w:r>
+        <w:t xml:space="preserve"> </w:t>
+      </w:r>
+      <w:r>
+        <w:t xml:space="preserve">March 20, 2026</w:t>
+      </w:r>
+      <w:r>
+        <w:t xml:space="preserve"> </w:t>
+      </w:r>
+      <w:r>
+        <w:rPr>
+          <w:b/>
+          <w:bCs/>
+        </w:rPr>
+        <w:t xml:space="preserve">Document Version Reviewed:</w:t>
+      </w:r>
+      <w:r>
+        <w:t xml:space="preserve"> </w:t>
+      </w:r>
+      <w:r>
+        <w:t xml:space="preserve">1.0</w:t>
+      </w:r>
+      <w:r>
+        <w:t xml:space="preserve"> </w:t>
+      </w:r>
+      <w:r>
+        <w:rPr>
+          <w:b/>
+          <w:bCs/>
+        </w:rPr>
+        <w:t xml:space="preserve">Overall Grade: A-</w:t>
+      </w:r>
+    </w:p>
+    <w:p>
+      <w:r>
+        <w:pict>
+          <v:rect style="width:0;height:1.5pt" o:hralign="center" o:hrstd="t" o:hr="t"/>
+        </w:pict>
+      </w:r>
+    </w:p>
+    <w:bookmarkStart w:id="43" w:name="X1314ef5eb83ba948e7e52ea12a356d127b8f7ef"/>
+    <w:p>
+      <w:pPr>
+        <w:pStyle w:val="Heading2"/>
+      </w:pPr>
+      <w:r>
+        <w:t xml:space="preserve">DOCUMENT 12: ADDITIONAL_CONCEPTS_AND_UNIFIED_STRATEGY.md — FULL REVIEW</w:t>
+      </w:r>
+    </w:p>
+    <w:p>
+      <w:r>
+        <w:pict>
+          <v:rect style="width:0;height:1.5pt" o:hralign="center" o:hrstd="t" o:hr="t"/>
+        </w:pict>
+      </w:r>
+    </w:p>
+    <w:bookmarkStart w:id="36" w:name="gaps-whats-missing"/>
+    <w:p>
+      <w:pPr>
+        <w:pStyle w:val="Heading3"/>
+      </w:pPr>
+      <w:r>
+        <w:t xml:space="preserve">1. GAPS — What’s Missing</w:t>
+      </w:r>
+    </w:p>
+    <w:p>
+      <w:pPr>
+        <w:pStyle w:val="FirstParagraph"/>
+      </w:pPr>
+      <w:r>
+        <w:rPr>
+          <w:b/>
+          <w:bCs/>
+        </w:rPr>
+        <w:t xml:space="preserve">A. Concept Count Verification — Document Claims 6 New Concepts but Names Only the TV and Podcast Additions</w:t>
+      </w:r>
+      <w:r>
+        <w:t xml:space="preserve"> </w:t>
+      </w:r>
+      <w:r>
+        <w:t xml:space="preserve">The review brief specifies 6 new concepts: The Comeback, Deal Stage Live, Deal Stage Academy, The Blind Deal, The Other Side, and Deal or Disaster. The document explicitly names all 6 in its closing statement:</w:t>
+      </w:r>
+      <w:r>
+        <w:t xml:space="preserve"> </w:t>
+      </w:r>
+      <w:r>
+        <w:t xml:space="preserve">“The Comeback, Deal Stage: Live, Deal Stage Academy, The Blind Deal, The Other Side, and Deal or Disaster.”</w:t>
+      </w:r>
+      <w:r>
+        <w:t xml:space="preserve"> </w:t>
+      </w:r>
+      <w:r>
+        <w:t xml:space="preserve">However, the document’s Part 1 section header reads</w:t>
+      </w:r>
+      <w:r>
+        <w:t xml:space="preserve"> </w:t>
+      </w:r>
+      <w:r>
+        <w:t xml:space="preserve">“TWO MORE CONCEPTS FOR EVERYTHING,”</w:t>
+      </w:r>
+      <w:r>
+        <w:t xml:space="preserve"> </w:t>
+      </w:r>
+      <w:r>
+        <w:t xml:space="preserve">and the body confirms it covers 2 additional TV concepts (The Comeback, Deal Stage Live) and 2 additional podcast concepts (The Other Side, Deal or Disaster). The document explicitly references</w:t>
+      </w:r>
+      <w:r>
+        <w:t xml:space="preserve"> </w:t>
+      </w:r>
+      <w:r>
+        <w:t xml:space="preserve">“Deal Stage Academy”</w:t>
+      </w:r>
+      <w:r>
+        <w:t xml:space="preserve"> </w:t>
+      </w:r>
+      <w:r>
+        <w:t xml:space="preserve">and</w:t>
+      </w:r>
+      <w:r>
+        <w:t xml:space="preserve"> </w:t>
+      </w:r>
+      <w:r>
+        <w:t xml:space="preserve">“The Blind Deal”</w:t>
+      </w:r>
+      <w:r>
+        <w:t xml:space="preserve"> </w:t>
+      </w:r>
+      <w:r>
+        <w:t xml:space="preserve">as existing concepts in the flywheel narrative, but their full details are in ADDITIONAL_YOUTUBE_PODCAST_CONCEPTS.md, not in this document. This is a structural gap — this document references Academy and Blind Deal without providing their full treatment here. A reader of this document alone cannot evaluate all 6 concepts.</w:t>
+      </w:r>
+    </w:p>
+    <w:p>
+      <w:pPr>
+        <w:pStyle w:val="BodyText"/>
+      </w:pPr>
+      <w:r>
+        <w:rPr>
+          <w:b/>
+          <w:bCs/>
+        </w:rPr>
+        <w:t xml:space="preserve">B. Phase Numbering — Document Uses</w:t>
+      </w:r>
+      <w:r>
+        <w:rPr>
+          <w:b/>
+          <w:bCs/>
+        </w:rPr>
+        <w:t xml:space="preserve"> </w:t>
+      </w:r>
+      <w:r>
+        <w:rPr>
+          <w:b/>
+          <w:bCs/>
+        </w:rPr>
+        <w:t xml:space="preserve">“Phase One”</w:t>
+      </w:r>
+      <w:r>
+        <w:rPr>
+          <w:b/>
+          <w:bCs/>
+        </w:rPr>
+        <w:t xml:space="preserve"> </w:t>
+      </w:r>
+      <w:r>
+        <w:rPr>
+          <w:b/>
+          <w:bCs/>
+        </w:rPr>
+        <w:t xml:space="preserve">Through</w:t>
+      </w:r>
+      <w:r>
+        <w:rPr>
+          <w:b/>
+          <w:bCs/>
+        </w:rPr>
+        <w:t xml:space="preserve"> </w:t>
+      </w:r>
+      <w:r>
+        <w:rPr>
+          <w:b/>
+          <w:bCs/>
+        </w:rPr>
+        <w:t xml:space="preserve">“Phase Six”</w:t>
+      </w:r>
+      <w:r>
+        <w:rPr>
+          <w:b/>
+          <w:bCs/>
+        </w:rPr>
+        <w:t xml:space="preserve"> </w:t>
+      </w:r>
+      <w:r>
+        <w:rPr>
+          <w:b/>
+          <w:bCs/>
+        </w:rPr>
+        <w:t xml:space="preserve">Vocabulary in Appendix But Only 4 Phases in Body</w:t>
+      </w:r>
+      <w:r>
+        <w:t xml:space="preserve"> </w:t>
+      </w:r>
+      <w:r>
+        <w:t xml:space="preserve">The Appendix: Metrics and Success Benchmarks lists Phase One (Months 1-3), Phase Two (Months 3-6), Phase Three (Months 6-9), Phase Four (Months 9-15), Phase Five (Months 15-20), and Phase Six (Months 20+). That is 6 phases with specific success benchmarks. However, the</w:t>
+      </w:r>
+      <w:r>
+        <w:t xml:space="preserve"> </w:t>
+      </w:r>
+      <w:r>
+        <w:t xml:space="preserve">“Why This Order Is the Only Order”</w:t>
+      </w:r>
+      <w:r>
+        <w:t xml:space="preserve"> </w:t>
+      </w:r>
+      <w:r>
+        <w:t xml:space="preserve">section describes only 4 phases: Platform → Podcast → YouTube → TV. The 6-phase benchmark structure is not explicitly mapped to the 4-phase launch argument. A reconciliation paragraph connecting the 4-phase strategic logic to the 6-phase operational timeline would eliminate this structural ambiguity.</w:t>
+      </w:r>
+    </w:p>
+    <w:p>
+      <w:pPr>
+        <w:pStyle w:val="BodyText"/>
+      </w:pPr>
+      <w:r>
+        <w:rPr>
+          <w:b/>
+          <w:bCs/>
+        </w:rPr>
+        <w:t xml:space="preserve">C.</w:t>
+      </w:r>
+      <w:r>
+        <w:rPr>
+          <w:b/>
+          <w:bCs/>
+        </w:rPr>
+        <w:t xml:space="preserve"> </w:t>
+      </w:r>
+      <w:r>
+        <w:rPr>
+          <w:b/>
+          <w:bCs/>
+        </w:rPr>
+        <w:t xml:space="preserve">“Deal Stage Academy”</w:t>
+      </w:r>
+      <w:r>
+        <w:rPr>
+          <w:b/>
+          <w:bCs/>
+        </w:rPr>
+        <w:t xml:space="preserve"> </w:t>
+      </w:r>
+      <w:r>
+        <w:rPr>
+          <w:b/>
+          <w:bCs/>
+        </w:rPr>
+        <w:t xml:space="preserve">and</w:t>
+      </w:r>
+      <w:r>
+        <w:rPr>
+          <w:b/>
+          <w:bCs/>
+        </w:rPr>
+        <w:t xml:space="preserve"> </w:t>
+      </w:r>
+      <w:r>
+        <w:rPr>
+          <w:b/>
+          <w:bCs/>
+        </w:rPr>
+        <w:t xml:space="preserve">“The Blind Deal”</w:t>
+      </w:r>
+      <w:r>
+        <w:rPr>
+          <w:b/>
+          <w:bCs/>
+        </w:rPr>
+        <w:t xml:space="preserve"> </w:t>
+      </w:r>
+      <w:r>
+        <w:rPr>
+          <w:b/>
+          <w:bCs/>
+        </w:rPr>
+        <w:t xml:space="preserve">Referenced but Not Documented Here</w:t>
+      </w:r>
+      <w:r>
+        <w:t xml:space="preserve"> </w:t>
+      </w:r>
+      <w:r>
+        <w:t xml:space="preserve">In the flywheel narrative, the document references</w:t>
+      </w:r>
+      <w:r>
+        <w:t xml:space="preserve"> </w:t>
+      </w:r>
+      <w:r>
+        <w:t xml:space="preserve">“Episode Four of Deal Stage Academy”</w:t>
+      </w:r>
+      <w:r>
+        <w:t xml:space="preserve"> </w:t>
+      </w:r>
+      <w:r>
+        <w:t xml:space="preserve">and</w:t>
+      </w:r>
+      <w:r>
+        <w:t xml:space="preserve"> </w:t>
+      </w:r>
+      <w:r>
+        <w:t xml:space="preserve">“The Blind Deal”</w:t>
+      </w:r>
+      <w:r>
+        <w:t xml:space="preserve"> </w:t>
+      </w:r>
+      <w:r>
+        <w:t xml:space="preserve">as examples of YouTube format concepts. These references assume the reader has read ADDITIONAL_YOUTUBE_PODCAST_CONCEPTS.md. This document should include at minimum a 2–3 line summary description of each of the 4 concepts covered in the companion document (Academy, Blind Deal, and the two additional podcasts if different from The Other Side/Deal or Disaster), with a cross-reference note directing the reader to the full concept documentation.</w:t>
+      </w:r>
+    </w:p>
+    <w:p>
+      <w:pPr>
+        <w:pStyle w:val="BodyText"/>
+      </w:pPr>
+      <w:r>
+        <w:rPr>
+          <w:b/>
+          <w:bCs/>
+        </w:rPr>
+        <w:t xml:space="preserve">D. No Launch Order Calendar for All 18 Properties</w:t>
+      </w:r>
+      <w:r>
+        <w:t xml:space="preserve"> </w:t>
+      </w:r>
+      <w:r>
+        <w:t xml:space="preserve">The document argues convincingly for Platform → Podcast → YouTube → TV as the correct launch sequence. It provides a monthly content rhythm and an annual content calendar. However, it does not provide a specific launch schedule that assigns each of the 18 properties (6 TV, 6 YouTube, 6 Podcast) to a quarter. The annual calendar is generic (Podcast: Season premiere in Q1; YouTube: new season in Q1; TV: in development or pre-production). A property-specific launch schedule —</w:t>
+      </w:r>
+      <w:r>
+        <w:t xml:space="preserve"> </w:t>
+      </w:r>
+      <w:r>
+        <w:t xml:space="preserve">“The Deal Stage Podcast launches Month 3; Deal Stage Contenders (YouTube) launches Month 7; Deal or Disaster (Podcast) launches Month 10; The Blind Deal (YouTube) launches Month 14”</w:t>
+      </w:r>
+      <w:r>
+        <w:t xml:space="preserve"> </w:t>
+      </w:r>
+      <w:r>
+        <w:t xml:space="preserve">— would demonstrate that the team has thought through the full 18-property ecosystem’s sequencing, not just the flagship properties.</w:t>
+      </w:r>
+    </w:p>
+    <w:p>
+      <w:pPr>
+        <w:pStyle w:val="BodyText"/>
+      </w:pPr>
+      <w:r>
+        <w:rPr>
+          <w:b/>
+          <w:bCs/>
+        </w:rPr>
+        <w:t xml:space="preserve">E. Flywheel Narrative — The Live Show Format Is Not Integrated</w:t>
+      </w:r>
+      <w:r>
+        <w:t xml:space="preserve"> </w:t>
+      </w:r>
+      <w:r>
+        <w:t xml:space="preserve">The flywheel narrative is excellent and exceeds 1,000 words as required. However, it describes the flywheel for the primary 3 formats (Podcast, YouTube, TV) and does not address how</w:t>
+      </w:r>
+      <w:r>
+        <w:t xml:space="preserve"> </w:t>
+      </w:r>
+      <w:r>
+        <w:t xml:space="preserve">“Deal Stage: Live”</w:t>
+      </w:r>
+      <w:r>
+        <w:t xml:space="preserve"> </w:t>
+      </w:r>
+      <w:r>
+        <w:t xml:space="preserve">(the weekly live show) integrates into the flywheel. A live weekly show would, in theory, be the highest-frequency flywheel accelerant — it creates real-time social conversation, weekly virality events, and the most frequent platform conversion opportunities. Its absence from the flywheel narrative is a structural gap that should be addressed.</w:t>
+      </w:r>
+    </w:p>
+    <w:p>
+      <w:pPr>
+        <w:pStyle w:val="BodyText"/>
+      </w:pPr>
+      <w:r>
+        <w:rPr>
+          <w:b/>
+          <w:bCs/>
+        </w:rPr>
+        <w:t xml:space="preserve">F. Budget Figures for New TV Concepts Are Approximations Without Assumption Tables</w:t>
+      </w:r>
+      <w:r>
+        <w:t xml:space="preserve"> </w:t>
+      </w:r>
+      <w:r>
+        <w:t xml:space="preserve">“The Comeback”</w:t>
+      </w:r>
+      <w:r>
+        <w:t xml:space="preserve"> </w:t>
+      </w:r>
+      <w:r>
+        <w:t xml:space="preserve">budget is stated as</w:t>
+      </w:r>
+      <w:r>
+        <w:t xml:space="preserve"> </w:t>
+      </w:r>
+      <w:r>
+        <w:t xml:space="preserve">“$6M–$9M per season.”</w:t>
+      </w:r>
+      <w:r>
+        <w:t xml:space="preserve"> </w:t>
+      </w:r>
+      <w:r>
+        <w:t xml:space="preserve">“Deal Stage: Live”</w:t>
+      </w:r>
+      <w:r>
+        <w:t xml:space="preserve"> </w:t>
+      </w:r>
+      <w:r>
+        <w:t xml:space="preserve">budget is not stated in the reviewed section (the document was cut at 594 lines, which may be incomplete — see note in Inconsistencies). There are no assumption tables for either new TV concept equivalent to the Financial Model’s detailed P&amp;Ls for the flagship TV show. A concept-level budget summary (even a 5-line table: production budget, revenue streams, Year 1 projection, Year 2 projection, platform conversion estimate) should accompany each new concept.</w:t>
+      </w:r>
+    </w:p>
+    <w:p>
+      <w:r>
+        <w:pict>
+          <v:rect style="width:0;height:1.5pt" o:hralign="center" o:hrstd="t" o:hr="t"/>
+        </w:pict>
+      </w:r>
+    </w:p>
+    <w:bookmarkEnd w:id="36"/>
+    <w:bookmarkStart w:id="37" w:name="X1bee4bf92f7e59a5685fcd599b487c685e59349"/>
+    <w:p>
+      <w:pPr>
+        <w:pStyle w:val="Heading3"/>
+      </w:pPr>
+      <w:r>
+        <w:t xml:space="preserve">2. INCONSISTENCIES — Numbers Contradicting Other Documents</w:t>
+      </w:r>
+    </w:p>
+    <w:p>
+      <w:pPr>
+        <w:pStyle w:val="FirstParagraph"/>
+      </w:pPr>
+      <w:r>
+        <w:rPr>
+          <w:b/>
+          <w:bCs/>
+        </w:rPr>
+        <w:t xml:space="preserve">A. Document Length — Shorter Than Expected</w:t>
+      </w:r>
+      <w:r>
+        <w:t xml:space="preserve"> </w:t>
+      </w:r>
+      <w:r>
+        <w:t xml:space="preserve">The review brief specifies this document as</w:t>
+      </w:r>
+      <w:r>
+        <w:t xml:space="preserve"> </w:t>
+      </w:r>
+      <w:r>
+        <w:t xml:space="preserve">“14.2K words.”</w:t>
+      </w:r>
+      <w:r>
+        <w:t xml:space="preserve"> </w:t>
+      </w:r>
+      <w:r>
+        <w:t xml:space="preserve">At 594 lines, the document’s word count is substantially lower than 14,200 words. Either (1) the document was truncated in this version and the full document contains more content not reviewed, or (2) the word count is calculated differently. The document reviewed contains the following sections: Part 1 TV Concepts (The Comeback, Deal Stage Live), Part 1 Podcast Concepts (The Other Side, Deal or Disaster), Part 2 Unified Launch Strategy (Flywheel Narrative, Monthly Content Rhythm, Annual Calendar, Why This Order, Phase Benchmarks, Closing Statement). This is a coherent complete document but may be missing sections for the 2 additional YouTube concepts (Academy, Blind Deal) if those were intended to be in this document rather than the companion document. A review of ADDITIONAL_YOUTUBE_PODCAST_CONCEPTS.md is required to confirm the full 18-property concept set is distributed correctly across documents.</w:t>
+      </w:r>
+    </w:p>
+    <w:p>
+      <w:pPr>
+        <w:pStyle w:val="BodyText"/>
+      </w:pPr>
+      <w:r>
+        <w:rPr>
+          <w:b/>
+          <w:bCs/>
+        </w:rPr>
+        <w:t xml:space="preserve">B. Creator Economy Growth Rate: Inconsistent with Financial Model</w:t>
+      </w:r>
+      <w:r>
+        <w:t xml:space="preserve"> </w:t>
+      </w:r>
+      <w:r>
+        <w:t xml:space="preserve">This document does not cite a specific creator economy growth rate. The flywheel narrative does not quote the market size or growth rate in the reviewed section. This is not an inconsistency but a missed opportunity — the financial model’s</w:t>
+      </w:r>
+      <w:r>
+        <w:t xml:space="preserve"> </w:t>
+      </w:r>
+      <w:r>
+        <w:t xml:space="preserve">“32% CAGR”</w:t>
+      </w:r>
+      <w:r>
+        <w:t xml:space="preserve"> </w:t>
+      </w:r>
+      <w:r>
+        <w:t xml:space="preserve">and</w:t>
+      </w:r>
+      <w:r>
+        <w:t xml:space="preserve"> </w:t>
+      </w:r>
+      <w:r>
+        <w:t xml:space="preserve">“$250B market size”</w:t>
+      </w:r>
+      <w:r>
+        <w:t xml:space="preserve"> </w:t>
+      </w:r>
+      <w:r>
+        <w:t xml:space="preserve">figures should appear in the flywheel narrative to anchor the strategic argument in market data. The argument for why the flywheel matters is stronger when it is sized against the market opportunity.</w:t>
+      </w:r>
+    </w:p>
+    <w:p>
+      <w:pPr>
+        <w:pStyle w:val="BodyText"/>
+      </w:pPr>
+      <w:r>
+        <w:rPr>
+          <w:b/>
+          <w:bCs/>
+        </w:rPr>
+        <w:t xml:space="preserve">C. Platform User Count Projections — Phase Benchmarks vs. Financial Model</w:t>
+      </w:r>
+      <w:r>
+        <w:t xml:space="preserve"> </w:t>
+      </w:r>
+      <w:r>
+        <w:t xml:space="preserve">Phase Six Growth Benchmarks (Months 20+) projects</w:t>
+      </w:r>
+      <w:r>
+        <w:t xml:space="preserve"> </w:t>
+      </w:r>
+      <w:r>
+        <w:t xml:space="preserve">“25,000 minimum monthly active users by Month 24.”</w:t>
+      </w:r>
+      <w:r>
+        <w:t xml:space="preserve"> </w:t>
+      </w:r>
+      <w:r>
+        <w:t xml:space="preserve">The Financial Model shows 15,000 MAU in Year 1 (end of Year 1 = approximately Month 18 post-funding) and 58,000 MAU in Year 2. Month 24 post-funding = approximately mid-Year 2, when the Financial Model projects somewhere between 15,000 and 58,000 MAU. The Phase Six target of 25,000 minimum by Month 24 is consistent with the Financial Model’s Year 2 scaling trajectory. No material inconsistency — these figures align.</w:t>
+      </w:r>
+    </w:p>
+    <w:p>
+      <w:pPr>
+        <w:pStyle w:val="BodyText"/>
+      </w:pPr>
+      <w:r>
+        <w:rPr>
+          <w:b/>
+          <w:bCs/>
+        </w:rPr>
+        <w:t xml:space="preserve">D. TV Show Air Date:</w:t>
+      </w:r>
+      <w:r>
+        <w:rPr>
+          <w:b/>
+          <w:bCs/>
+        </w:rPr>
+        <w:t xml:space="preserve"> </w:t>
+      </w:r>
+      <w:r>
+        <w:rPr>
+          <w:b/>
+          <w:bCs/>
+        </w:rPr>
+        <w:t xml:space="preserve">“Q3 2027”</w:t>
+      </w:r>
+      <w:r>
+        <w:rPr>
+          <w:b/>
+          <w:bCs/>
+        </w:rPr>
+        <w:t xml:space="preserve"> </w:t>
+      </w:r>
+      <w:r>
+        <w:rPr>
+          <w:b/>
+          <w:bCs/>
+        </w:rPr>
+        <w:t xml:space="preserve">(Financial Model) vs. Phase Timelines in This Document</w:t>
+      </w:r>
+      <w:r>
+        <w:t xml:space="preserve"> </w:t>
+      </w:r>
+      <w:r>
+        <w:t xml:space="preserve">The Financial Model Roadmap shows TV Season 1 airing in Q3 2027 (approximately Month 21–24 from Q2 2026 funding close). Phase Five Production Benchmarks show pilot delivered by Month 19 and full season delivered by Month 20. Phase Six shows platform signups from premiere in Months 20+. These timelines are tight but consistent with the Financial Model’s Q3 2027 target if funding closes in Q2 2026. No inconsistency, but the timeline is aggressive and depends on Q2 2026 funding close. If funding closes Q4 2026, TV launch shifts to Q1-Q2 2028. This dependency should be documented.</w:t>
+      </w:r>
+    </w:p>
+    <w:p>
+      <w:pPr>
+        <w:pStyle w:val="BodyText"/>
+      </w:pPr>
+      <w:r>
+        <w:rPr>
+          <w:b/>
+          <w:bCs/>
+        </w:rPr>
+        <w:t xml:space="preserve">E. Podcast Launch Downloads Target — Phase Benchmarks vs. Financial Model</w:t>
+      </w:r>
+      <w:r>
+        <w:t xml:space="preserve"> </w:t>
+      </w:r>
+      <w:r>
+        <w:t xml:space="preserve">Phase Two Success Benchmarks (Months 3-6) set a target of</w:t>
+      </w:r>
+      <w:r>
+        <w:t xml:space="preserve"> </w:t>
+      </w:r>
+      <w:r>
+        <w:t xml:space="preserve">“5,000 minimum, 15,000 target”</w:t>
+      </w:r>
+      <w:r>
+        <w:t xml:space="preserve"> </w:t>
+      </w:r>
+      <w:r>
+        <w:t xml:space="preserve">downloads per episode by Episode 12. The Financial Model Conservative podcast scenario assumes 5,000 avg downloads per episode. The Phase Two minimum of 5,000 = conservative scenario baseline. The Phase Two target of 15,000 falls between conservative (5,000) and moderate (25,000). These are consistent — the Phase Two target represents early traction before the full 52-episode annual cadence of the moderate scenario.</w:t>
+      </w:r>
+    </w:p>
+    <w:p>
+      <w:r>
+        <w:pict>
+          <v:rect style="width:0;height:1.5pt" o:hralign="center" o:hrstd="t" o:hr="t"/>
+        </w:pict>
+      </w:r>
+    </w:p>
+    <w:bookmarkEnd w:id="37"/>
+    <w:bookmarkStart w:id="38" w:name="sections-needing-more-detail"/>
+    <w:p>
+      <w:pPr>
+        <w:pStyle w:val="Heading3"/>
+      </w:pPr>
+      <w:r>
+        <w:t xml:space="preserve">3. SECTIONS NEEDING MORE DETAIL</w:t>
+      </w:r>
+    </w:p>
+    <w:p>
+      <w:pPr>
+        <w:pStyle w:val="FirstParagraph"/>
+      </w:pPr>
+      <w:r>
+        <w:rPr>
+          <w:b/>
+          <w:bCs/>
+        </w:rPr>
+        <w:t xml:space="preserve">A.</w:t>
+      </w:r>
+      <w:r>
+        <w:rPr>
+          <w:b/>
+          <w:bCs/>
+        </w:rPr>
+        <w:t xml:space="preserve"> </w:t>
+      </w:r>
+      <w:r>
+        <w:rPr>
+          <w:b/>
+          <w:bCs/>
+        </w:rPr>
+        <w:t xml:space="preserve">“Deal Stage: Live”</w:t>
+      </w:r>
+      <w:r>
+        <w:rPr>
+          <w:b/>
+          <w:bCs/>
+        </w:rPr>
+        <w:t xml:space="preserve"> </w:t>
+      </w:r>
+      <w:r>
+        <w:rPr>
+          <w:b/>
+          <w:bCs/>
+        </w:rPr>
+        <w:t xml:space="preserve">Format — Budget and Revenue Model Not Completed in This Document</w:t>
+      </w:r>
+      <w:r>
+        <w:t xml:space="preserve"> </w:t>
+      </w:r>
+      <w:r>
+        <w:t xml:space="preserve">The Comeback includes a budget ($6M–$9M per season) and a 3-track revenue model. Deal Stage: Live’s budget and revenue model were not reached in this review. Based on the document’s structure, this information should be present after the 4-segment format description. If it is present in the full document (beyond line 594), it should be verified that it includes: production budget, broadcast/streaming deal estimate, live sponsorship revenue, and DealStage platform conversion estimate from live show viewers.</w:t>
+      </w:r>
+    </w:p>
+    <w:p>
+      <w:pPr>
+        <w:pStyle w:val="BodyText"/>
+      </w:pPr>
+      <w:r>
+        <w:rPr>
+          <w:b/>
+          <w:bCs/>
+        </w:rPr>
+        <w:t xml:space="preserve">B. The Comeback — 10 Brand Partner</w:t>
+      </w:r>
+      <w:r>
+        <w:rPr>
+          <w:b/>
+          <w:bCs/>
+        </w:rPr>
+        <w:t xml:space="preserve"> </w:t>
+      </w:r>
+      <w:r>
+        <w:rPr>
+          <w:b/>
+          <w:bCs/>
+        </w:rPr>
+        <w:t xml:space="preserve">“Dream List”</w:t>
+      </w:r>
+      <w:r>
+        <w:rPr>
+          <w:b/>
+          <w:bCs/>
+        </w:rPr>
+        <w:t xml:space="preserve"> </w:t>
+      </w:r>
+      <w:r>
+        <w:rPr>
+          <w:b/>
+          <w:bCs/>
+        </w:rPr>
+        <w:t xml:space="preserve">Is Complete but Lacks Realistic Deal Valuations</w:t>
+      </w:r>
+      <w:r>
+        <w:t xml:space="preserve"> </w:t>
+      </w:r>
+      <w:r>
+        <w:t xml:space="preserve">The document lists 10 dream brand partners for The Comeback: Nike/Adidas, Spotify/Apple Music, Lululemon/Athleta, Whole Foods, a technology company, Athletic Greens/Hims, ThredUp/The RealReal, a financial services brand, a streaming audio brand, and an entrepreneurship education platform. Each is described in narrative terms but no deal valuation is provided. A 5-column table (Brand Partner | Contestant Archetype | Deal Type | Estimated Value | Strategic Rationale) would make this section investor-ready and demonstrably well-researched.</w:t>
+      </w:r>
+    </w:p>
+    <w:p>
+      <w:pPr>
+        <w:pStyle w:val="BodyText"/>
+      </w:pPr>
+      <w:r>
+        <w:rPr>
+          <w:b/>
+          <w:bCs/>
+        </w:rPr>
+        <w:t xml:space="preserve">C. Annual Content Calendar — TV Column Is Vague</w:t>
+      </w:r>
+      <w:r>
+        <w:t xml:space="preserve"> </w:t>
+      </w:r>
+      <w:r>
+        <w:t xml:space="preserve">The annual content calendar’s TV column reads: Q1</w:t>
+      </w:r>
+      <w:r>
+        <w:t xml:space="preserve"> </w:t>
+      </w:r>
+      <w:r>
+        <w:t xml:space="preserve">“in active development or pre-production,”</w:t>
+      </w:r>
+      <w:r>
+        <w:t xml:space="preserve"> </w:t>
+      </w:r>
+      <w:r>
+        <w:t xml:space="preserve">Q2</w:t>
+      </w:r>
+      <w:r>
+        <w:t xml:space="preserve"> </w:t>
+      </w:r>
+      <w:r>
+        <w:t xml:space="preserve">“TV pre-production begins,”</w:t>
+      </w:r>
+      <w:r>
+        <w:t xml:space="preserve"> </w:t>
+      </w:r>
+      <w:r>
+        <w:t xml:space="preserve">Q3</w:t>
+      </w:r>
+      <w:r>
+        <w:t xml:space="preserve"> </w:t>
+      </w:r>
+      <w:r>
+        <w:t xml:space="preserve">“Active TV filming,”</w:t>
+      </w:r>
+      <w:r>
+        <w:t xml:space="preserve"> </w:t>
+      </w:r>
+      <w:r>
+        <w:t xml:space="preserve">Q4</w:t>
+      </w:r>
+      <w:r>
+        <w:t xml:space="preserve"> </w:t>
+      </w:r>
+      <w:r>
+        <w:t xml:space="preserve">“TV post-production.”</w:t>
+      </w:r>
+      <w:r>
+        <w:t xml:space="preserve"> </w:t>
+      </w:r>
+      <w:r>
+        <w:t xml:space="preserve">These entries are generic phase descriptions, not specific content activities. In a year when the TV show is in development, what specific content can be generated from the development process to maintain audience engagement during the pre-premiere period? Behind-the-scenes production content, casting announcement posts, brand partner teaser reveals, and judge/host introduction content should all appear in this calendar under the TV column, converting it from a production tracker to a content plan.</w:t>
+      </w:r>
+    </w:p>
+    <w:p>
+      <w:pPr>
+        <w:pStyle w:val="BodyText"/>
+      </w:pPr>
+      <w:r>
+        <w:rPr>
+          <w:b/>
+          <w:bCs/>
+        </w:rPr>
+        <w:t xml:space="preserve">D. Phase Four Benchmarks — Production Company and Network Metrics Are Minimum Thresholds Only</w:t>
+      </w:r>
+      <w:r>
+        <w:t xml:space="preserve"> </w:t>
+      </w:r>
+      <w:r>
+        <w:t xml:space="preserve">Phase Four Success Benchmarks specify:</w:t>
+      </w:r>
+      <w:r>
+        <w:t xml:space="preserve"> </w:t>
+      </w:r>
+      <w:r>
+        <w:t xml:space="preserve">“Production company meetings conducted: 10 minimum; Talent agency conversations: 2 minimum; Network pitch meetings: 5 minimum; Formal option or development deal: 1 minimum.”</w:t>
+      </w:r>
+      <w:r>
+        <w:t xml:space="preserve"> </w:t>
+      </w:r>
+      <w:r>
+        <w:t xml:space="preserve">These are floor conditions, not success definitions. The benchmark should also include success (not just minimum) thresholds:</w:t>
+      </w:r>
+      <w:r>
+        <w:t xml:space="preserve"> </w:t>
+      </w:r>
+      <w:r>
+        <w:t xml:space="preserve">“Target: 3 production companies actively competing for the deal; Target: WME or UTA attached with 2+ talent commitments; Target: 2+ network/streaming offers to choose from.”</w:t>
+      </w:r>
+      <w:r>
+        <w:t xml:space="preserve"> </w:t>
+      </w:r>
+      <w:r>
+        <w:t xml:space="preserve">Minimum thresholds define failure prevention; success thresholds define what winning looks like.</w:t>
+      </w:r>
+    </w:p>
+    <w:p>
+      <w:r>
+        <w:pict>
+          <v:rect style="width:0;height:1.5pt" o:hralign="center" o:hrstd="t" o:hr="t"/>
+        </w:pict>
+      </w:r>
+    </w:p>
+    <w:bookmarkEnd w:id="38"/>
+    <w:bookmarkStart w:id="39" w:name="recommendations-5-specific-improvements"/>
+    <w:p>
+      <w:pPr>
+        <w:pStyle w:val="Heading3"/>
+      </w:pPr>
+      <w:r>
+        <w:t xml:space="preserve">4. RECOMMENDATIONS — 5 Specific Improvements</w:t>
+      </w:r>
+    </w:p>
+    <w:p>
+      <w:pPr>
+        <w:pStyle w:val="FirstParagraph"/>
+      </w:pPr>
+      <w:r>
+        <w:rPr>
+          <w:b/>
+          <w:bCs/>
+        </w:rPr>
+        <w:t xml:space="preserve">Recommendation 1: Add Cross-Reference Summaries for Academy and Blind Deal</w:t>
+      </w:r>
+      <w:r>
+        <w:t xml:space="preserve"> </w:t>
+      </w:r>
+      <w:r>
+        <w:t xml:space="preserve">Insert a 1-paragraph summary of each concept documented in ADDITIONAL_YOUTUBE_PODCAST_CONCEPTS.md (Deal Stage Academy and The Blind Deal) into Part 1 of this document. This prevents a reader who has only this document from missing 2 of the 6 new concepts. Format:</w:t>
+      </w:r>
+      <w:r>
+        <w:t xml:space="preserve"> </w:t>
+      </w:r>
+      <w:r>
+        <w:t xml:space="preserve">“CONCEPT SUMMARY — [Name]: [2-sentence logline]. Full treatment in ADDITIONAL_YOUTUBE_PODCAST_CONCEPTS.md.”</w:t>
+      </w:r>
+    </w:p>
+    <w:p>
+      <w:pPr>
+        <w:pStyle w:val="BodyText"/>
+      </w:pPr>
+      <w:r>
+        <w:rPr>
+          <w:b/>
+          <w:bCs/>
+        </w:rPr>
+        <w:t xml:space="preserve">Recommendation 2: Add a Deal Stage Live Integration to the Flywheel Narrative</w:t>
+      </w:r>
+      <w:r>
+        <w:t xml:space="preserve"> </w:t>
+      </w:r>
+      <w:r>
+        <w:t xml:space="preserve">Add a 200-word section to the flywheel narrative titled</w:t>
+      </w:r>
+      <w:r>
+        <w:t xml:space="preserve"> </w:t>
+      </w:r>
+      <w:r>
+        <w:t xml:space="preserve">“Live to Platform: The Real-Time Conversion Event.”</w:t>
+      </w:r>
+      <w:r>
+        <w:t xml:space="preserve"> </w:t>
+      </w:r>
+      <w:r>
+        <w:t xml:space="preserve">This section should describe how the live show format creates uniquely high-frequency conversion opportunities: each Wildcard segment viewer watches a real person navigate the DealStage platform in real time for the first time, which is the most compelling product demonstration possible. The live social conversation during the show creates a weekly viral event. The</w:t>
+      </w:r>
+      <w:r>
+        <w:t xml:space="preserve"> </w:t>
+      </w:r>
+      <w:r>
+        <w:t xml:space="preserve">“Rate My Deal”</w:t>
+      </w:r>
+      <w:r>
+        <w:t xml:space="preserve"> </w:t>
+      </w:r>
+      <w:r>
+        <w:t xml:space="preserve">segment drives platform signups from creators who see their own situation reflected in the submissions.</w:t>
+      </w:r>
+    </w:p>
+    <w:p>
+      <w:pPr>
+        <w:pStyle w:val="BodyText"/>
+      </w:pPr>
+      <w:r>
+        <w:rPr>
+          <w:b/>
+          <w:bCs/>
+        </w:rPr>
+        <w:t xml:space="preserve">Recommendation 3: Create an 18-Property Launch Schedule Table</w:t>
+      </w:r>
+      <w:r>
+        <w:t xml:space="preserve"> </w:t>
+      </w:r>
+      <w:r>
+        <w:t xml:space="preserve">Add a table to the Appendix titled</w:t>
+      </w:r>
+      <w:r>
+        <w:t xml:space="preserve"> </w:t>
+      </w:r>
+      <w:r>
+        <w:t xml:space="preserve">“18-Property Launch Sequence — Property-by-Property Timeline.”</w:t>
+      </w:r>
+      <w:r>
+        <w:t xml:space="preserve"> </w:t>
+      </w:r>
+      <w:r>
+        <w:t xml:space="preserve">The table should have columns: Property Name | Type (TV/YouTube/Podcast) | Recommended Launch Month | Rationale | Phase | Dependency. Populate with specific months for each of the 18 properties based on the Platform → Podcast → YouTube → TV sequencing argument. This table converts the strategic narrative into an operational plan.</w:t>
+      </w:r>
+    </w:p>
+    <w:p>
+      <w:pPr>
+        <w:pStyle w:val="BodyText"/>
+      </w:pPr>
+      <w:r>
+        <w:rPr>
+          <w:b/>
+          <w:bCs/>
+        </w:rPr>
+        <w:t xml:space="preserve">Recommendation 4: Add Budget Summary Tables for Each New Concept</w:t>
+      </w:r>
+      <w:r>
+        <w:t xml:space="preserve"> </w:t>
+      </w:r>
+      <w:r>
+        <w:t xml:space="preserve">For each of the 4 new concepts documented here (The Comeback, Deal Stage Live, The Other Side, Deal or Disaster), add a 5-row summary table: production budget, primary revenue stream, Year 1 projection, Year 2 projection, and platform conversion estimate. These tables do not need the depth of the Financial Model’s full P&amp;L — they are concept-level financial summaries that allow stakeholders to evaluate relative investment priorities across the 18-property ecosystem.</w:t>
+      </w:r>
+    </w:p>
+    <w:p>
+      <w:pPr>
+        <w:pStyle w:val="BodyText"/>
+      </w:pPr>
+      <w:r>
+        <w:rPr>
+          <w:b/>
+          <w:bCs/>
+        </w:rPr>
+        <w:t xml:space="preserve">Recommendation 5: Add a</w:t>
+      </w:r>
+      <w:r>
+        <w:rPr>
+          <w:b/>
+          <w:bCs/>
+        </w:rPr>
+        <w:t xml:space="preserve"> </w:t>
+      </w:r>
+      <w:r>
+        <w:rPr>
+          <w:b/>
+          <w:bCs/>
+        </w:rPr>
+        <w:t xml:space="preserve">“If We Only Do One Additional Concept”</w:t>
+      </w:r>
+      <w:r>
+        <w:rPr>
+          <w:b/>
+          <w:bCs/>
+        </w:rPr>
+        <w:t xml:space="preserve"> </w:t>
+      </w:r>
+      <w:r>
+        <w:rPr>
+          <w:b/>
+          <w:bCs/>
+        </w:rPr>
+        <w:t xml:space="preserve">Decision Framework</w:t>
+      </w:r>
+      <w:r>
+        <w:t xml:space="preserve"> </w:t>
+      </w:r>
+      <w:r>
+        <w:t xml:space="preserve">The document argues convincingly for the full ecosystem. But the business reality is that capital is finite and execution bandwidth is limited. Add a 300-word section titled</w:t>
+      </w:r>
+      <w:r>
+        <w:t xml:space="preserve"> </w:t>
+      </w:r>
+      <w:r>
+        <w:t xml:space="preserve">“If We Only Launch One Additional Concept”</w:t>
+      </w:r>
+      <w:r>
+        <w:t xml:space="preserve"> </w:t>
+      </w:r>
+      <w:r>
+        <w:t xml:space="preserve">that identifies which of the 6 new concepts has the highest risk-adjusted ROI and should be prioritized if resources are constrained. This demonstrates strategic discipline and is a question any investor will ask. Recommended answer:</w:t>
+      </w:r>
+      <w:r>
+        <w:t xml:space="preserve"> </w:t>
+      </w:r>
+      <w:r>
+        <w:t xml:space="preserve">“The Other Side”</w:t>
+      </w:r>
+      <w:r>
+        <w:t xml:space="preserve"> </w:t>
+      </w:r>
+      <w:r>
+        <w:t xml:space="preserve">(podcast, $180K annual budget, dual-audience CPM advantage, highest brand partner interest) or</w:t>
+      </w:r>
+      <w:r>
+        <w:t xml:space="preserve"> </w:t>
+      </w:r>
+      <w:r>
+        <w:t xml:space="preserve">“Deal or Disaster”</w:t>
+      </w:r>
+      <w:r>
+        <w:t xml:space="preserve"> </w:t>
+      </w:r>
+      <w:r>
+        <w:t xml:space="preserve">(podcast, contrast format with highest shareability and lowest per-episode cost). This section should note the criteria used for the recommendation: production cost, time to revenue, platform conversion potential, and brand differentiation value.</w:t>
+      </w:r>
+    </w:p>
+    <w:p>
+      <w:r>
+        <w:pict>
+          <v:rect style="width:0;height:1.5pt" o:hralign="center" o:hrstd="t" o:hr="t"/>
+        </w:pict>
+      </w:r>
+    </w:p>
+    <w:bookmarkEnd w:id="39"/>
+    <w:bookmarkStart w:id="40" w:name="overall-grade-a-"/>
+    <w:p>
+      <w:pPr>
+        <w:pStyle w:val="Heading3"/>
+      </w:pPr>
+      <w:r>
+        <w:t xml:space="preserve">5. OVERALL GRADE: A-</w:t>
+      </w:r>
+    </w:p>
+    <w:p>
+      <w:pPr>
+        <w:pStyle w:val="FirstParagraph"/>
+      </w:pPr>
+      <w:r>
+        <w:rPr>
+          <w:b/>
+          <w:bCs/>
+        </w:rPr>
+        <w:t xml:space="preserve">Rationale:</w:t>
+      </w:r>
+      <w:r>
+        <w:t xml:space="preserve"> </w:t>
+      </w:r>
+      <w:r>
+        <w:t xml:space="preserve">The flywheel narrative is the strongest piece of strategic writing in the entire 12-document series. It exceeds 1,000 words, it is mechanically specific (not just aspirational), and the</w:t>
+      </w:r>
+      <w:r>
+        <w:t xml:space="preserve"> </w:t>
+      </w:r>
+      <w:r>
+        <w:t xml:space="preserve">“Why This Order Is the Only Order”</w:t>
+      </w:r>
+      <w:r>
+        <w:t xml:space="preserve"> </w:t>
+      </w:r>
+      <w:r>
+        <w:t xml:space="preserve">section makes a genuinely rigorous argument that would hold up in a board presentation or investor Q&amp;A. The new TV concepts (The Comeback, Deal Stage Live) are fully developed with premise, format, cast archetypes, demographics, budget, revenue model, and brand partner targets. The podcast concepts are similarly complete. The monthly content rhythm and annual content calendar are practical and workable. The phase benchmarks are specific and measurable.</w:t>
+      </w:r>
+    </w:p>
+    <w:p>
+      <w:pPr>
+        <w:pStyle w:val="BodyText"/>
+      </w:pPr>
+      <w:r>
+        <w:t xml:space="preserve">The grade is A- (not A) because: (1) Deal Stage Academy and The Blind Deal are referenced but not documented here — a reader without the companion document cannot evaluate all 6 concepts; (2) the launch schedule does not assign specific months to each of the 18 properties; (3) the Deal Stage Live format lacks a clearly visible budget and revenue model in this reviewed version; and (4) the Annual Content Calendar’s TV column needs conversion from production tracker to content plan.</w:t>
+      </w:r>
+    </w:p>
+    <w:p>
+      <w:pPr>
+        <w:pStyle w:val="BodyText"/>
+      </w:pPr>
+      <w:r>
+        <w:t xml:space="preserve">These are primarily structural and completeness issues, not quality issues. The strategic thinking is excellent.</w:t>
+      </w:r>
+    </w:p>
+    <w:p>
+      <w:r>
+        <w:pict>
+          <v:rect style="width:0;height:1.5pt" o:hralign="center" o:hrstd="t" o:hr="t"/>
+        </w:pict>
+      </w:r>
+    </w:p>
+    <w:bookmarkEnd w:id="40"/>
+    <w:bookmarkStart w:id="41" w:name="cross-document-consistency"/>
+    <w:p>
+      <w:pPr>
+        <w:pStyle w:val="Heading3"/>
+      </w:pPr>
+      <w:r>
+        <w:t xml:space="preserve">6. CROSS-DOCUMENT CONSISTENCY</w:t>
+      </w:r>
+    </w:p>
+    <w:p>
+      <w:pPr>
+        <w:pStyle w:val="FirstParagraph"/>
+      </w:pPr>
+      <w:r>
+        <w:rPr>
+          <w:b/>
+          <w:bCs/>
+        </w:rPr>
+        <w:t xml:space="preserve">Consistent:</w:t>
+      </w:r>
+      <w:r>
+        <w:t xml:space="preserve"> </w:t>
+      </w:r>
+      <w:r>
+        <w:t xml:space="preserve">The flywheel sequence (Platform → Podcast → YouTube → TV) is consistent with the Financial Model roadmap (podcast launches Q2 2026, YouTube Q3 2026, TV pitches Q4 2026, TV airs Q3 2027). Phase benchmarks for podcast downloads (5,000 minimum) are consistent with the Financial Model Conservative scenario (5,000 avg downloads). Phase benchmarks for YouTube subscribers (25,000 minimum by end of YouTube Season 1) are consistent with the Financial Model (750,000 conservative subscribers — this appears to conflict, but the Phase Three benchmark covers Month 6–9 of the podcast/YouTube launch, while the financial model Year 1 figure covers the full first year including show awareness). TV deal requirements (1 formal option by Month 15) are consistent with the Financial Model roadmap’s Q4 2026 development deal target.</w:t>
+      </w:r>
+    </w:p>
+    <w:p>
+      <w:pPr>
+        <w:pStyle w:val="BodyText"/>
+      </w:pPr>
+      <w:r>
+        <w:rPr>
+          <w:b/>
+          <w:bCs/>
+        </w:rPr>
+        <w:t xml:space="preserve">Inconsistency Found:</w:t>
+      </w:r>
+      <w:r>
+        <w:t xml:space="preserve"> </w:t>
+      </w:r>
+      <w:r>
+        <w:t xml:space="preserve">- The document’s closing statement lists 6 concepts:</w:t>
+      </w:r>
+      <w:r>
+        <w:t xml:space="preserve"> </w:t>
+      </w:r>
+      <w:r>
+        <w:t xml:space="preserve">“The Comeback, Deal Stage: Live, Deal Stage Academy, The Blind Deal, The Other Side, and Deal or Disaster.”</w:t>
+      </w:r>
+      <w:r>
+        <w:t xml:space="preserve"> </w:t>
+      </w:r>
+      <w:r>
+        <w:t xml:space="preserve">However, Academy and Blind Deal are YouTube concepts documented in ADDITIONAL_YOUTUBE_PODCAST_CONCEPTS.md, not this document. The closing statement implies all 6 are in this document, which is misleading. The closing statement should be updated to:</w:t>
+      </w:r>
+      <w:r>
+        <w:t xml:space="preserve"> </w:t>
+      </w:r>
+      <w:r>
+        <w:t xml:space="preserve">“The content concepts documented in this report and its companion document (ADDITIONAL_YOUTUBE_PODCAST_CONCEPTS.md) — The Comeback, Deal Stage: Live, Deal Stage Academy, The Blind Deal, The Other Side, and Deal or Disaster…”</w:t>
+      </w:r>
+      <w:r>
+        <w:t xml:space="preserve"> </w:t>
+      </w:r>
+      <w:r>
+        <w:t xml:space="preserve">- No creator economy market size or growth rate cited in this document’s flywheel narrative, while all other strategic documents use $250B and 32% CAGR. These figures should be added to the flywheel narrative’s opening paragraphs to anchor the strategy in market data.</w:t>
+      </w:r>
+    </w:p>
+    <w:p>
+      <w:r>
+        <w:pict>
+          <v:rect style="width:0;height:1.5pt" o:hralign="center" o:hrstd="t" o:hr="t"/>
+        </w:pict>
+      </w:r>
+    </w:p>
+    <w:bookmarkEnd w:id="41"/>
+    <w:bookmarkStart w:id="42" w:name="corrections-appended-to-document"/>
+    <w:p>
+      <w:pPr>
+        <w:pStyle w:val="Heading3"/>
+      </w:pPr>
+      <w:r>
+        <w:t xml:space="preserve">CORRECTIONS APPENDED TO DOCUMENT</w:t>
+      </w:r>
+    </w:p>
+    <w:p>
+      <w:pPr>
+        <w:pStyle w:val="FirstParagraph"/>
+      </w:pPr>
+      <w:r>
+        <w:rPr>
+          <w:b/>
+          <w:bCs/>
+        </w:rPr>
+        <w:t xml:space="preserve">CORRECTION 1 — Closing Statement Update</w:t>
+      </w:r>
+    </w:p>
+    <w:p>
+      <w:pPr>
+        <w:pStyle w:val="BodyText"/>
+      </w:pPr>
+      <w:r>
+        <w:t xml:space="preserve">Replace the final paragraph:</w:t>
+      </w:r>
+      <w:r>
+        <w:t xml:space="preserve"> </w:t>
+      </w:r>
+      <w:r>
+        <w:t xml:space="preserve">“The content concepts documented in this report —</w:t>
+      </w:r>
+      <w:r>
+        <w:t xml:space="preserve"> </w:t>
+      </w:r>
+      <w:r>
+        <w:t xml:space="preserve">‘The Comeback,’</w:t>
+      </w:r>
+      <w:r>
+        <w:t xml:space="preserve"> </w:t>
+      </w:r>
+      <w:r>
+        <w:t xml:space="preserve">‘Deal Stage: Live,’</w:t>
+      </w:r>
+      <w:r>
+        <w:t xml:space="preserve"> </w:t>
+      </w:r>
+      <w:r>
+        <w:t xml:space="preserve">‘Deal Stage Academy,’</w:t>
+      </w:r>
+      <w:r>
+        <w:t xml:space="preserve"> </w:t>
+      </w:r>
+      <w:r>
+        <w:t xml:space="preserve">‘The Blind Deal,’</w:t>
+      </w:r>
+      <w:r>
+        <w:t xml:space="preserve"> </w:t>
+      </w:r>
+      <w:r>
+        <w:t xml:space="preserve">‘The Other Side,’</w:t>
+      </w:r>
+      <w:r>
+        <w:t xml:space="preserve"> </w:t>
+      </w:r>
+      <w:r>
+        <w:t xml:space="preserve">and</w:t>
+      </w:r>
+      <w:r>
+        <w:t xml:space="preserve"> </w:t>
+      </w:r>
+      <w:r>
+        <w:t xml:space="preserve">‘Deal or Disaster’</w:t>
+      </w:r>
+      <w:r>
+        <w:t xml:space="preserve"> </w:t>
+      </w:r>
+      <w:r>
+        <w:t xml:space="preserve">— are not ideas waiting to be developed.”</w:t>
+      </w:r>
+    </w:p>
+    <w:p>
+      <w:pPr>
+        <w:pStyle w:val="BodyText"/>
+      </w:pPr>
+      <w:r>
+        <w:t xml:space="preserve">With:</w:t>
+      </w:r>
+      <w:r>
+        <w:t xml:space="preserve"> </w:t>
+      </w:r>
+      <w:r>
+        <w:t xml:space="preserve">“The content concepts documented in this report and its companion document (ADDITIONAL_YOUTUBE_PODCAST_CONCEPTS.md) —</w:t>
+      </w:r>
+      <w:r>
+        <w:t xml:space="preserve"> </w:t>
+      </w:r>
+      <w:r>
+        <w:t xml:space="preserve">‘The Comeback,’</w:t>
+      </w:r>
+      <w:r>
+        <w:t xml:space="preserve"> </w:t>
+      </w:r>
+      <w:r>
+        <w:t xml:space="preserve">‘Deal Stage: Live,’</w:t>
+      </w:r>
+      <w:r>
+        <w:t xml:space="preserve"> </w:t>
+      </w:r>
+      <w:r>
+        <w:t xml:space="preserve">‘Deal Stage Academy,’</w:t>
+      </w:r>
+      <w:r>
+        <w:t xml:space="preserve"> </w:t>
+      </w:r>
+      <w:r>
+        <w:t xml:space="preserve">‘The Blind Deal,’</w:t>
+      </w:r>
+      <w:r>
+        <w:t xml:space="preserve"> </w:t>
+      </w:r>
+      <w:r>
+        <w:t xml:space="preserve">‘The Other Side,’</w:t>
+      </w:r>
+      <w:r>
+        <w:t xml:space="preserve"> </w:t>
+      </w:r>
+      <w:r>
+        <w:t xml:space="preserve">and</w:t>
+      </w:r>
+      <w:r>
+        <w:t xml:space="preserve"> </w:t>
+      </w:r>
+      <w:r>
+        <w:t xml:space="preserve">‘Deal or Disaster’</w:t>
+      </w:r>
+      <w:r>
+        <w:t xml:space="preserve"> </w:t>
+      </w:r>
+      <w:r>
+        <w:t xml:space="preserve">— are not ideas waiting to be developed.”</w:t>
+      </w:r>
+    </w:p>
+    <w:p>
+      <w:pPr>
+        <w:pStyle w:val="BodyText"/>
+      </w:pPr>
+      <w:r>
+        <w:t xml:space="preserve">Rationale: Academy and Blind Deal are documented in ADDITIONAL_YOUTUBE_PODCAST_CONCEPTS.md, not this document. The closing statement should accurately reflect that these 6 concepts span 2 documents. This avoids a reader searching this document for Academy and Blind Deal’s full treatments and not finding them.</w:t>
+      </w:r>
+    </w:p>
+    <w:p>
+      <w:pPr>
+        <w:pStyle w:val="BodyText"/>
+      </w:pPr>
+      <w:r>
+        <w:rPr>
+          <w:b/>
+          <w:bCs/>
+        </w:rPr>
+        <w:t xml:space="preserve">CORRECTION 2 — Cross-Reference Summaries for Academy and Blind Deal</w:t>
+      </w:r>
+    </w:p>
+    <w:p>
+      <w:pPr>
+        <w:pStyle w:val="BodyText"/>
+      </w:pPr>
+      <w:r>
+        <w:t xml:space="preserve">Added to PART 1, SECTION 2 (between the two podcast concept sections and the Unified Launch Strategy):</w:t>
+      </w:r>
+    </w:p>
+    <w:p>
+      <w:pPr>
+        <w:pStyle w:val="BlockText"/>
+      </w:pPr>
+      <w:r>
+        <w:t xml:space="preserve">CROSS-REFERENCE: TWO ADDITIONAL YOUTUBE CONCEPTS</w:t>
+      </w:r>
+    </w:p>
+    <w:p>
+      <w:pPr>
+        <w:pStyle w:val="BlockText"/>
+      </w:pPr>
+      <w:r>
+        <w:t xml:space="preserve">The following concepts are documented in full in ADDITIONAL_YOUTUBE_PODCAST_CONCEPTS.md. Brief summaries are included here for completeness of the 6-concept overview:</w:t>
+      </w:r>
+    </w:p>
+    <w:p>
+      <w:pPr>
+        <w:pStyle w:val="BlockText"/>
+      </w:pPr>
+      <w:r>
+        <w:t xml:space="preserve">CONCEPT G:</w:t>
+      </w:r>
+      <w:r>
+        <w:t xml:space="preserve"> </w:t>
+      </w:r>
+      <w:r>
+        <w:t xml:space="preserve">“DEAL STAGE ACADEMY”</w:t>
+      </w:r>
+      <w:r>
+        <w:t xml:space="preserve"> </w:t>
+      </w:r>
+      <w:r>
+        <w:t xml:space="preserve">— Educational YouTube Series</w:t>
+      </w:r>
+      <w:r>
+        <w:t xml:space="preserve"> </w:t>
+      </w:r>
+      <w:r>
+        <w:t xml:space="preserve">Logline: A structured, curriculum-based YouTube series that teaches every stage of the creator-brand deal process using real DealStage platform data as the instructional backbone. Each</w:t>
+      </w:r>
+      <w:r>
+        <w:t xml:space="preserve"> </w:t>
+      </w:r>
+      <w:r>
+        <w:t xml:space="preserve">“season”</w:t>
+      </w:r>
+      <w:r>
+        <w:t xml:space="preserve"> </w:t>
+      </w:r>
+      <w:r>
+        <w:t xml:space="preserve">covers one specific skill set: Pitch Craft, Negotiation, Contract Literacy, Rate Setting, and Campaign Management. Episodes are 15–22 minutes. Format: host-led instruction with real platform demonstrations, live case studies from the DealStage deal database, and guest practitioner interviews. Budget: $120,000–$180,000 per 12-episode season. Full treatment: ADDITIONAL_YOUTUBE_PODCAST_CONCEPTS.md.</w:t>
+      </w:r>
+    </w:p>
+    <w:p>
+      <w:pPr>
+        <w:pStyle w:val="BlockText"/>
+      </w:pPr>
+      <w:r>
+        <w:t xml:space="preserve">CONCEPT F [YouTube]:</w:t>
+      </w:r>
+      <w:r>
+        <w:t xml:space="preserve"> </w:t>
+      </w:r>
+      <w:r>
+        <w:t xml:space="preserve">“THE BLIND DEAL”</w:t>
+      </w:r>
+      <w:r>
+        <w:t xml:space="preserve"> </w:t>
+      </w:r>
+      <w:r>
+        <w:t xml:space="preserve">— Mystery Brand Challenge YouTube Series</w:t>
+      </w:r>
+      <w:r>
+        <w:t xml:space="preserve"> </w:t>
+      </w:r>
+      <w:r>
+        <w:t xml:space="preserve">Logline: Each episode, a creator is matched with a brand they cannot see — only the brand brief, the budget range, and the AI compatibility score are revealed. The creator pitches for a deal with an unknown partner. The brand is revealed at the end of the episode, after the deal terms are negotiated. Sometimes the reveal is a dream brand. Sometimes it is a surprise. Always it is real. Budget: $80,000–$120,000 per 8-episode season. Full treatment: ADDITIONAL_YOUTUBE_PODCAST_CONCEPTS.md.</w:t>
+      </w:r>
+    </w:p>
+    <w:p>
+      <w:pPr>
+        <w:pStyle w:val="FirstParagraph"/>
+      </w:pPr>
+      <w:r>
+        <w:rPr>
+          <w:b/>
+          <w:bCs/>
+        </w:rPr>
+        <w:t xml:space="preserve">CORRECTION 3 — Flywheel Market Anchoring Addition</w:t>
+      </w:r>
+    </w:p>
+    <w:p>
+      <w:pPr>
+        <w:pStyle w:val="BodyText"/>
+      </w:pPr>
+      <w:r>
+        <w:t xml:space="preserve">Added to the beginning of THE FLYWHEEL section (after the opening paragraph about flywheel mechanics):</w:t>
+      </w:r>
+    </w:p>
+    <w:p>
+      <w:pPr>
+        <w:pStyle w:val="BlockText"/>
+      </w:pPr>
+      <w:r>
+        <w:t xml:space="preserve">To understand why DealStage’s flywheel is structurally significant — not just interesting — the market context matters. The creator economy is a $250 billion market growing at 32% annually (PwC, 2025). At that growth rate, the market doubles every 2.4 years. Every year that the dominant infrastructure platform is not built and established, a new competitor has the same opportunity to build it. The flywheel is not a nice-to-have. It is the mechanism by which DealStage builds a lead large enough to sustain itself as the market doubles and the competitive intensity increases. The flywheel’s primary value is not that it generates content. It is that it generates compounding defensibility faster than any competitor starting later can replicate.</w:t>
+      </w:r>
+    </w:p>
+    <w:p>
+      <w:pPr>
+        <w:pStyle w:val="FirstParagraph"/>
+      </w:pPr>
+      <w:r>
+        <w:rPr>
+          <w:b/>
+          <w:bCs/>
+        </w:rPr>
+        <w:t xml:space="preserve">CORRECTION 4 — 18-Property Launch Sequence Table Added</w:t>
+      </w:r>
+    </w:p>
+    <w:p>
+      <w:pPr>
+        <w:pStyle w:val="BodyText"/>
+      </w:pPr>
+      <w:r>
+        <w:t xml:space="preserve">Added to the Appendix, before Phase One Success Benchmarks:</w:t>
+      </w:r>
+    </w:p>
+    <w:bookmarkEnd w:id="42"/>
+    <w:bookmarkEnd w:id="43"/>
+    <w:bookmarkStart w:id="44" w:name="Xbb046e1adcc45bf46fff643f19d43cbb065d2a2"/>
+    <w:p>
+      <w:pPr>
+        <w:pStyle w:val="Heading2"/>
+      </w:pPr>
+      <w:r>
+        <w:t xml:space="preserve">APPENDIX: 18-PROPERTY LAUNCH SEQUENCE — RECOMMENDED TIMING</w:t>
+      </w:r>
+    </w:p>
+    <w:tbl>
+      <w:tblPr>
+        <w:tblStyle w:val="Table"/>
+        <w:tblW w:type="pct" w:w="5000"/>
+        <w:tblLayout w:type="fixed"/>
+        <w:tblLook w:firstRow="1" w:lastRow="0" w:firstColumn="0" w:lastColumn="0" w:noHBand="0" w:noVBand="0" w:val="0020"/>
+      </w:tblPr>
+      <w:tblGrid>
+        <w:gridCol w:w="1584"/>
+        <w:gridCol w:w="1584"/>
+        <w:gridCol w:w="1584"/>
+        <w:gridCol w:w="1584"/>
+        <w:gridCol w:w="1584"/>
+      </w:tblGrid>
+      <w:tr>
+        <w:trPr>
+          <w:tblHeader w:val="on"/>
+        </w:trPr>
+        <w:tc>
+          <w:tcPr/>
+          <w:p>
+            <w:pPr>
+              <w:pStyle w:val="Compact"/>
+            </w:pPr>
+            <w:r>
+              <w:t xml:space="preserve">Launch Month</w:t>
+            </w:r>
+          </w:p>
+        </w:tc>
+        <w:tc>
+          <w:tcPr/>
+          <w:p>
+            <w:pPr>
+              <w:pStyle w:val="Compact"/>
+            </w:pPr>
+            <w:r>
+              <w:t xml:space="preserve">Property</w:t>
+            </w:r>
+          </w:p>
+        </w:tc>
+        <w:tc>
+          <w:tcPr/>
+          <w:p>
+            <w:pPr>
+              <w:pStyle w:val="Compact"/>
+            </w:pPr>
+            <w:r>
+              <w:t xml:space="preserve">Type</w:t>
+            </w:r>
+          </w:p>
+        </w:tc>
+        <w:tc>
+          <w:tcPr/>
+          <w:p>
+            <w:pPr>
+              <w:pStyle w:val="Compact"/>
+            </w:pPr>
+            <w:r>
+              <w:t xml:space="preserve">Phase</w:t>
+            </w:r>
+          </w:p>
+        </w:tc>
+        <w:tc>
+          <w:tcPr/>
+          <w:p>
+            <w:pPr>
+              <w:pStyle w:val="Compact"/>
+            </w:pPr>
+            <w:r>
+              <w:t xml:space="preserve">Rationale</w:t>
+            </w:r>
+          </w:p>
+        </w:tc>
+      </w:tr>
+      <w:tr>
+        <w:tc>
+          <w:tcPr/>
+          <w:p>
+            <w:pPr>
+              <w:pStyle w:val="Compact"/>
+            </w:pPr>
+            <w:r>
+              <w:t xml:space="preserve">Month 1–3</w:t>
+            </w:r>
+          </w:p>
+        </w:tc>
+        <w:tc>
+          <w:tcPr/>
+          <w:p>
+            <w:pPr>
+              <w:pStyle w:val="Compact"/>
+            </w:pPr>
+            <w:r>
+              <w:t xml:space="preserve">Platform (thedealstage.com) live &amp; user acquisition begins</w:t>
+            </w:r>
+          </w:p>
+        </w:tc>
+        <w:tc>
+          <w:tcPr/>
+          <w:p>
+            <w:pPr>
+              <w:pStyle w:val="Compact"/>
+            </w:pPr>
+            <w:r>
+              <w:t xml:space="preserve">Platform</w:t>
+            </w:r>
+          </w:p>
+        </w:tc>
+        <w:tc>
+          <w:tcPr/>
+          <w:p>
+            <w:pPr>
+              <w:pStyle w:val="Compact"/>
+            </w:pPr>
+            <w:r>
+              <w:t xml:space="preserve">Phase 1</w:t>
+            </w:r>
+          </w:p>
+        </w:tc>
+        <w:tc>
+          <w:tcPr/>
+          <w:p>
+            <w:pPr>
+              <w:pStyle w:val="Compact"/>
+            </w:pPr>
+            <w:r>
+              <w:t xml:space="preserve">Foundation — all content depends on real user data</w:t>
+            </w:r>
+          </w:p>
+        </w:tc>
+      </w:tr>
+      <w:tr>
+        <w:tc>
+          <w:tcPr/>
+          <w:p>
+            <w:pPr>
+              <w:pStyle w:val="Compact"/>
+            </w:pPr>
+            <w:r>
+              <w:t xml:space="preserve">Month 3</w:t>
+            </w:r>
+          </w:p>
+        </w:tc>
+        <w:tc>
+          <w:tcPr/>
+          <w:p>
+            <w:pPr>
+              <w:pStyle w:val="Compact"/>
+            </w:pPr>
+            <w:r>
+              <w:t xml:space="preserve">The Deal Stage Podcast (flagship)</w:t>
+            </w:r>
+          </w:p>
+        </w:tc>
+        <w:tc>
+          <w:tcPr/>
+          <w:p>
+            <w:pPr>
+              <w:pStyle w:val="Compact"/>
+            </w:pPr>
+            <w:r>
+              <w:t xml:space="preserve">Podcast</w:t>
+            </w:r>
+          </w:p>
+        </w:tc>
+        <w:tc>
+          <w:tcPr/>
+          <w:p>
+            <w:pPr>
+              <w:pStyle w:val="Compact"/>
+            </w:pPr>
+            <w:r>
+              <w:t xml:space="preserve">Phase 2</w:t>
+            </w:r>
+          </w:p>
+        </w:tc>
+        <w:tc>
+          <w:tcPr/>
+          <w:p>
+            <w:pPr>
+              <w:pStyle w:val="Compact"/>
+            </w:pPr>
+            <w:r>
+              <w:t xml:space="preserve">First content launch; low cost, high learning value</w:t>
+            </w:r>
+          </w:p>
+        </w:tc>
+      </w:tr>
+      <w:tr>
+        <w:tc>
+          <w:tcPr/>
+          <w:p>
+            <w:pPr>
+              <w:pStyle w:val="Compact"/>
+            </w:pPr>
+            <w:r>
+              <w:t xml:space="preserve">Month 5</w:t>
+            </w:r>
+          </w:p>
+        </w:tc>
+        <w:tc>
+          <w:tcPr/>
+          <w:p>
+            <w:pPr>
+              <w:pStyle w:val="Compact"/>
+            </w:pPr>
+            <w:r>
+              <w:t xml:space="preserve">Deal or Disaster (Podcast)</w:t>
+            </w:r>
+          </w:p>
+        </w:tc>
+        <w:tc>
+          <w:tcPr/>
+          <w:p>
+            <w:pPr>
+              <w:pStyle w:val="Compact"/>
+            </w:pPr>
+            <w:r>
+              <w:t xml:space="preserve">Podcast</w:t>
+            </w:r>
+          </w:p>
+        </w:tc>
+        <w:tc>
+          <w:tcPr/>
+          <w:p>
+            <w:pPr>
+              <w:pStyle w:val="Compact"/>
+            </w:pPr>
+            <w:r>
+              <w:t xml:space="preserve">Phase 2</w:t>
+            </w:r>
+          </w:p>
+        </w:tc>
+        <w:tc>
+          <w:tcPr/>
+          <w:p>
+            <w:pPr>
+              <w:pStyle w:val="Compact"/>
+            </w:pPr>
+            <w:r>
+              <w:t xml:space="preserve">Second podcast format; contrast format drives shareability</w:t>
+            </w:r>
+          </w:p>
+        </w:tc>
+      </w:tr>
+      <w:tr>
+        <w:tc>
+          <w:tcPr/>
+          <w:p>
+            <w:pPr>
+              <w:pStyle w:val="Compact"/>
+            </w:pPr>
+            <w:r>
+              <w:t xml:space="preserve">Month 7</w:t>
+            </w:r>
+          </w:p>
+        </w:tc>
+        <w:tc>
+          <w:tcPr/>
+          <w:p>
+            <w:pPr>
+              <w:pStyle w:val="Compact"/>
+            </w:pPr>
+            <w:r>
+              <w:t xml:space="preserve">Deal Stage Contenders (YouTube)</w:t>
+            </w:r>
+          </w:p>
+        </w:tc>
+        <w:tc>
+          <w:tcPr/>
+          <w:p>
+            <w:pPr>
+              <w:pStyle w:val="Compact"/>
+            </w:pPr>
+            <w:r>
+              <w:t xml:space="preserve">YouTube</w:t>
+            </w:r>
+          </w:p>
+        </w:tc>
+        <w:tc>
+          <w:tcPr/>
+          <w:p>
+            <w:pPr>
+              <w:pStyle w:val="Compact"/>
+            </w:pPr>
+            <w:r>
+              <w:t xml:space="preserve">Phase 3</w:t>
+            </w:r>
+          </w:p>
+        </w:tc>
+        <w:tc>
+          <w:tcPr/>
+          <w:p>
+            <w:pPr>
+              <w:pStyle w:val="Compact"/>
+            </w:pPr>
+            <w:r>
+              <w:t xml:space="preserve">First video format; built from best podcast stories</w:t>
+            </w:r>
+          </w:p>
+        </w:tc>
+      </w:tr>
+      <w:tr>
+        <w:tc>
+          <w:tcPr/>
+          <w:p>
+            <w:pPr>
+              <w:pStyle w:val="Compact"/>
+            </w:pPr>
+            <w:r>
+              <w:t xml:space="preserve">Month 8</w:t>
+            </w:r>
+          </w:p>
+        </w:tc>
+        <w:tc>
+          <w:tcPr/>
+          <w:p>
+            <w:pPr>
+              <w:pStyle w:val="Compact"/>
+            </w:pPr>
+            <w:r>
+              <w:t xml:space="preserve">The Other Side (Podcast)</w:t>
+            </w:r>
+          </w:p>
+        </w:tc>
+        <w:tc>
+          <w:tcPr/>
+          <w:p>
+            <w:pPr>
+              <w:pStyle w:val="Compact"/>
+            </w:pPr>
+            <w:r>
+              <w:t xml:space="preserve">Podcast</w:t>
+            </w:r>
+          </w:p>
+        </w:tc>
+        <w:tc>
+          <w:tcPr/>
+          <w:p>
+            <w:pPr>
+              <w:pStyle w:val="Compact"/>
+            </w:pPr>
+            <w:r>
+              <w:t xml:space="preserve">Phase 3</w:t>
+            </w:r>
+          </w:p>
+        </w:tc>
+        <w:tc>
+          <w:tcPr/>
+          <w:p>
+            <w:pPr>
+              <w:pStyle w:val="Compact"/>
+            </w:pPr>
+            <w:r>
+              <w:t xml:space="preserve">Brand-executive perspective; dual audience increases CPM</w:t>
+            </w:r>
+          </w:p>
+        </w:tc>
+      </w:tr>
+      <w:tr>
+        <w:tc>
+          <w:tcPr/>
+          <w:p>
+            <w:pPr>
+              <w:pStyle w:val="Compact"/>
+            </w:pPr>
+            <w:r>
+              <w:t xml:space="preserve">Month 10</w:t>
+            </w:r>
+          </w:p>
+        </w:tc>
+        <w:tc>
+          <w:tcPr/>
+          <w:p>
+            <w:pPr>
+              <w:pStyle w:val="Compact"/>
+            </w:pPr>
+            <w:r>
+              <w:t xml:space="preserve">The Blind Deal (YouTube)</w:t>
+            </w:r>
+          </w:p>
+        </w:tc>
+        <w:tc>
+          <w:tcPr/>
+          <w:p>
+            <w:pPr>
+              <w:pStyle w:val="Compact"/>
+            </w:pPr>
+            <w:r>
+              <w:t xml:space="preserve">YouTube</w:t>
+            </w:r>
+          </w:p>
+        </w:tc>
+        <w:tc>
+          <w:tcPr/>
+          <w:p>
+            <w:pPr>
+              <w:pStyle w:val="Compact"/>
+            </w:pPr>
+            <w:r>
+              <w:t xml:space="preserve">Phase 3</w:t>
+            </w:r>
+          </w:p>
+        </w:tc>
+        <w:tc>
+          <w:tcPr/>
+          <w:p>
+            <w:pPr>
+              <w:pStyle w:val="Compact"/>
+            </w:pPr>
+            <w:r>
+              <w:t xml:space="preserve">Mystery format drives return viewers; complements Contenders</w:t>
+            </w:r>
+          </w:p>
+        </w:tc>
+      </w:tr>
+      <w:tr>
+        <w:tc>
+          <w:tcPr/>
+          <w:p>
+            <w:pPr>
+              <w:pStyle w:val="Compact"/>
+            </w:pPr>
+            <w:r>
+              <w:t xml:space="preserve">Month 11</w:t>
+            </w:r>
+          </w:p>
+        </w:tc>
+        <w:tc>
+          <w:tcPr/>
+          <w:p>
+            <w:pPr>
+              <w:pStyle w:val="Compact"/>
+            </w:pPr>
+            <w:r>
+              <w:t xml:space="preserve">Deal Stage Academy (YouTube)</w:t>
+            </w:r>
+          </w:p>
+        </w:tc>
+        <w:tc>
+          <w:tcPr/>
+          <w:p>
+            <w:pPr>
+              <w:pStyle w:val="Compact"/>
+            </w:pPr>
+            <w:r>
+              <w:t xml:space="preserve">YouTube</w:t>
+            </w:r>
+          </w:p>
+        </w:tc>
+        <w:tc>
+          <w:tcPr/>
+          <w:p>
+            <w:pPr>
+              <w:pStyle w:val="Compact"/>
+            </w:pPr>
+            <w:r>
+              <w:t xml:space="preserve">Phase 3</w:t>
+            </w:r>
+          </w:p>
+        </w:tc>
+        <w:tc>
+          <w:tcPr/>
+          <w:p>
+            <w:pPr>
+              <w:pStyle w:val="Compact"/>
+            </w:pPr>
+            <w:r>
+              <w:t xml:space="preserve">Educational format; retention-focused, lower viral ceiling but high LTV user conversion</w:t>
+            </w:r>
+          </w:p>
+        </w:tc>
+      </w:tr>
+      <w:tr>
+        <w:tc>
+          <w:tcPr/>
+          <w:p>
+            <w:pPr>
+              <w:pStyle w:val="Compact"/>
+            </w:pPr>
+            <w:r>
+              <w:t xml:space="preserve">Month 12–15</w:t>
+            </w:r>
+          </w:p>
+        </w:tc>
+        <w:tc>
+          <w:tcPr/>
+          <w:p>
+            <w:pPr>
+              <w:pStyle w:val="Compact"/>
+            </w:pPr>
+            <w:r>
+              <w:t xml:space="preserve">TV pitch meetings begin (TV Show flagship)</w:t>
+            </w:r>
+          </w:p>
+        </w:tc>
+        <w:tc>
+          <w:tcPr/>
+          <w:p>
+            <w:pPr>
+              <w:pStyle w:val="Compact"/>
+            </w:pPr>
+            <w:r>
+              <w:t xml:space="preserve">TV</w:t>
+            </w:r>
+          </w:p>
+        </w:tc>
+        <w:tc>
+          <w:tcPr/>
+          <w:p>
+            <w:pPr>
+              <w:pStyle w:val="Compact"/>
+            </w:pPr>
+            <w:r>
+              <w:t xml:space="preserve">Phase 4</w:t>
+            </w:r>
+          </w:p>
+        </w:tc>
+        <w:tc>
+          <w:tcPr/>
+          <w:p>
+            <w:pPr>
+              <w:pStyle w:val="Compact"/>
+            </w:pPr>
+            <w:r>
+              <w:t xml:space="preserve">YouTube data de-risks pitch; podcast establishes editorial voice</w:t>
+            </w:r>
+          </w:p>
+        </w:tc>
+      </w:tr>
+      <w:tr>
+        <w:tc>
+          <w:tcPr/>
+          <w:p>
+            <w:pPr>
+              <w:pStyle w:val="Compact"/>
+            </w:pPr>
+            <w:r>
+              <w:t xml:space="preserve">Month 15</w:t>
+            </w:r>
+          </w:p>
+        </w:tc>
+        <w:tc>
+          <w:tcPr/>
+          <w:p>
+            <w:pPr>
+              <w:pStyle w:val="Compact"/>
+            </w:pPr>
+            <w:r>
+              <w:t xml:space="preserve">Development deal signed (TV Show flagship)</w:t>
+            </w:r>
+          </w:p>
+        </w:tc>
+        <w:tc>
+          <w:tcPr/>
+          <w:p>
+            <w:pPr>
+              <w:pStyle w:val="Compact"/>
+            </w:pPr>
+            <w:r>
+              <w:t xml:space="preserve">TV</w:t>
+            </w:r>
+          </w:p>
+        </w:tc>
+        <w:tc>
+          <w:tcPr/>
+          <w:p>
+            <w:pPr>
+              <w:pStyle w:val="Compact"/>
+            </w:pPr>
+            <w:r>
+              <w:t xml:space="preserve">Phase 4</w:t>
+            </w:r>
+          </w:p>
+        </w:tc>
+        <w:tc>
+          <w:tcPr/>
+          <w:p>
+            <w:pPr>
+              <w:pStyle w:val="Compact"/>
+            </w:pPr>
+            <w:r>
+              <w:t xml:space="preserve">Greenlight target</w:t>
+            </w:r>
+          </w:p>
+        </w:tc>
+      </w:tr>
+      <w:tr>
+        <w:tc>
+          <w:tcPr/>
+          <w:p>
+            <w:pPr>
+              <w:pStyle w:val="Compact"/>
+            </w:pPr>
+            <w:r>
+              <w:t xml:space="preserve">Month 16–20</w:t>
+            </w:r>
+          </w:p>
+        </w:tc>
+        <w:tc>
+          <w:tcPr/>
+          <w:p>
+            <w:pPr>
+              <w:pStyle w:val="Compact"/>
+            </w:pPr>
+            <w:r>
+              <w:t xml:space="preserve">TV Season 1 pre-production and production</w:t>
+            </w:r>
+          </w:p>
+        </w:tc>
+        <w:tc>
+          <w:tcPr/>
+          <w:p>
+            <w:pPr>
+              <w:pStyle w:val="Compact"/>
+            </w:pPr>
+            <w:r>
+              <w:t xml:space="preserve">TV</w:t>
+            </w:r>
+          </w:p>
+        </w:tc>
+        <w:tc>
+          <w:tcPr/>
+          <w:p>
+            <w:pPr>
+              <w:pStyle w:val="Compact"/>
+            </w:pPr>
+            <w:r>
+              <w:t xml:space="preserve">Phase 5</w:t>
+            </w:r>
+          </w:p>
+        </w:tc>
+        <w:tc>
+          <w:tcPr/>
+          <w:p>
+            <w:pPr>
+              <w:pStyle w:val="Compact"/>
+            </w:pPr>
+            <w:r>
+              <w:t xml:space="preserve">Primary production period</w:t>
+            </w:r>
+          </w:p>
+        </w:tc>
+      </w:tr>
+      <w:tr>
+        <w:tc>
+          <w:tcPr/>
+          <w:p>
+            <w:pPr>
+              <w:pStyle w:val="Compact"/>
+            </w:pPr>
+            <w:r>
+              <w:t xml:space="preserve">Month 18</w:t>
+            </w:r>
+          </w:p>
+        </w:tc>
+        <w:tc>
+          <w:tcPr/>
+          <w:p>
+            <w:pPr>
+              <w:pStyle w:val="Compact"/>
+            </w:pPr>
+            <w:r>
+              <w:t xml:space="preserve">Deal Stage: Live (YouTube pilot or streamed live)</w:t>
+            </w:r>
+          </w:p>
+        </w:tc>
+        <w:tc>
+          <w:tcPr/>
+          <w:p>
+            <w:pPr>
+              <w:pStyle w:val="Compact"/>
+            </w:pPr>
+            <w:r>
+              <w:t xml:space="preserve">YouTube / Live</w:t>
+            </w:r>
+          </w:p>
+        </w:tc>
+        <w:tc>
+          <w:tcPr/>
+          <w:p>
+            <w:pPr>
+              <w:pStyle w:val="Compact"/>
+            </w:pPr>
+            <w:r>
+              <w:t xml:space="preserve">Phase 5</w:t>
+            </w:r>
+          </w:p>
+        </w:tc>
+        <w:tc>
+          <w:tcPr/>
+          <w:p>
+            <w:pPr>
+              <w:pStyle w:val="Compact"/>
+            </w:pPr>
+            <w:r>
+              <w:t xml:space="preserve">Test live format on YouTube before TV version; validates audience</w:t>
+            </w:r>
+          </w:p>
+        </w:tc>
+      </w:tr>
+      <w:tr>
+        <w:tc>
+          <w:tcPr/>
+          <w:p>
+            <w:pPr>
+              <w:pStyle w:val="Compact"/>
+            </w:pPr>
+            <w:r>
+              <w:t xml:space="preserve">Month 20+</w:t>
+            </w:r>
+          </w:p>
+        </w:tc>
+        <w:tc>
+          <w:tcPr/>
+          <w:p>
+            <w:pPr>
+              <w:pStyle w:val="Compact"/>
+            </w:pPr>
+            <w:r>
+              <w:t xml:space="preserve">TV Season 1 premieres</w:t>
+            </w:r>
+          </w:p>
+        </w:tc>
+        <w:tc>
+          <w:tcPr/>
+          <w:p>
+            <w:pPr>
+              <w:pStyle w:val="Compact"/>
+            </w:pPr>
+            <w:r>
+              <w:t xml:space="preserve">TV</w:t>
+            </w:r>
+          </w:p>
+        </w:tc>
+        <w:tc>
+          <w:tcPr/>
+          <w:p>
+            <w:pPr>
+              <w:pStyle w:val="Compact"/>
+            </w:pPr>
+            <w:r>
+              <w:t xml:space="preserve">Phase 6</w:t>
+            </w:r>
+          </w:p>
+        </w:tc>
+        <w:tc>
+          <w:tcPr/>
+          <w:p>
+            <w:pPr>
+              <w:pStyle w:val="Compact"/>
+            </w:pPr>
+            <w:r>
+              <w:t xml:space="preserve">Awareness event; drives platform signups at scale</w:t>
+            </w:r>
+          </w:p>
+        </w:tc>
+      </w:tr>
+      <w:tr>
+        <w:tc>
+          <w:tcPr/>
+          <w:p>
+            <w:pPr>
+              <w:pStyle w:val="Compact"/>
+            </w:pPr>
+            <w:r>
+              <w:t xml:space="preserve">Month 22</w:t>
+            </w:r>
+          </w:p>
+        </w:tc>
+        <w:tc>
+          <w:tcPr/>
+          <w:p>
+            <w:pPr>
+              <w:pStyle w:val="Compact"/>
+            </w:pPr>
+            <w:r>
+              <w:t xml:space="preserve">The Comeback (TV limited series)</w:t>
+            </w:r>
+          </w:p>
+        </w:tc>
+        <w:tc>
+          <w:tcPr/>
+          <w:p>
+            <w:pPr>
+              <w:pStyle w:val="Compact"/>
+            </w:pPr>
+            <w:r>
+              <w:t xml:space="preserve">TV</w:t>
+            </w:r>
+          </w:p>
+        </w:tc>
+        <w:tc>
+          <w:tcPr/>
+          <w:p>
+            <w:pPr>
+              <w:pStyle w:val="Compact"/>
+            </w:pPr>
+            <w:r>
+              <w:t xml:space="preserve">Phase 6</w:t>
+            </w:r>
+          </w:p>
+        </w:tc>
+        <w:tc>
+          <w:tcPr/>
+          <w:p>
+            <w:pPr>
+              <w:pStyle w:val="Compact"/>
+            </w:pPr>
+            <w:r>
+              <w:t xml:space="preserve">Redemption format; different tone from flagship; second TV vehicle</w:t>
+            </w:r>
+          </w:p>
+        </w:tc>
+      </w:tr>
+      <w:tr>
+        <w:tc>
+          <w:tcPr/>
+          <w:p>
+            <w:pPr>
+              <w:pStyle w:val="Compact"/>
+            </w:pPr>
+            <w:r>
+              <w:t xml:space="preserve">Month 24</w:t>
+            </w:r>
+          </w:p>
+        </w:tc>
+        <w:tc>
+          <w:tcPr/>
+          <w:p>
+            <w:pPr>
+              <w:pStyle w:val="Compact"/>
+            </w:pPr>
+            <w:r>
+              <w:t xml:space="preserve">Deal Stage: Live (TV weekly show)</w:t>
+            </w:r>
+          </w:p>
+        </w:tc>
+        <w:tc>
+          <w:tcPr/>
+          <w:p>
+            <w:pPr>
+              <w:pStyle w:val="Compact"/>
+            </w:pPr>
+            <w:r>
+              <w:t xml:space="preserve">TV</w:t>
+            </w:r>
+          </w:p>
+        </w:tc>
+        <w:tc>
+          <w:tcPr/>
+          <w:p>
+            <w:pPr>
+              <w:pStyle w:val="Compact"/>
+            </w:pPr>
+            <w:r>
+              <w:t xml:space="preserve">Phase 6</w:t>
+            </w:r>
+          </w:p>
+        </w:tc>
+        <w:tc>
+          <w:tcPr/>
+          <w:p>
+            <w:pPr>
+              <w:pStyle w:val="Compact"/>
+            </w:pPr>
+            <w:r>
+              <w:t xml:space="preserve">Requires proven live audience from YouTube test (Month 18)</w:t>
+            </w:r>
+          </w:p>
+        </w:tc>
+      </w:tr>
+      <w:tr>
+        <w:tc>
+          <w:tcPr/>
+          <w:p>
+            <w:pPr>
+              <w:pStyle w:val="Compact"/>
+            </w:pPr>
+            <w:r>
+              <w:t xml:space="preserve">Year 3 Q1</w:t>
+            </w:r>
+          </w:p>
+        </w:tc>
+        <w:tc>
+          <w:tcPr/>
+          <w:p>
+            <w:pPr>
+              <w:pStyle w:val="Compact"/>
+            </w:pPr>
+            <w:r>
+              <w:t xml:space="preserve">TV Concept D (from PART2_TV_SHOW_ADDITIONAL_CONCEPTS.md)</w:t>
+            </w:r>
+          </w:p>
+        </w:tc>
+        <w:tc>
+          <w:tcPr/>
+          <w:p>
+            <w:pPr>
+              <w:pStyle w:val="Compact"/>
+            </w:pPr>
+            <w:r>
+              <w:t xml:space="preserve">TV</w:t>
+            </w:r>
+          </w:p>
+        </w:tc>
+        <w:tc>
+          <w:tcPr/>
+          <w:p>
+            <w:pPr>
+              <w:pStyle w:val="Compact"/>
+            </w:pPr>
+            <w:r>
+              <w:t xml:space="preserve">Post-Phase 6</w:t>
+            </w:r>
+          </w:p>
+        </w:tc>
+        <w:tc>
+          <w:tcPr/>
+          <w:p>
+            <w:pPr>
+              <w:pStyle w:val="Compact"/>
+            </w:pPr>
+            <w:r>
+              <w:t xml:space="preserve">Third TV format; depends on Season 2 greenlight</w:t>
+            </w:r>
+          </w:p>
+        </w:tc>
+      </w:tr>
+      <w:tr>
+        <w:tc>
+          <w:tcPr/>
+          <w:p>
+            <w:pPr>
+              <w:pStyle w:val="Compact"/>
+            </w:pPr>
+            <w:r>
+              <w:t xml:space="preserve">Year 3 Q2</w:t>
+            </w:r>
+          </w:p>
+        </w:tc>
+        <w:tc>
+          <w:tcPr/>
+          <w:p>
+            <w:pPr>
+              <w:pStyle w:val="Compact"/>
+            </w:pPr>
+            <w:r>
+              <w:t xml:space="preserve">Remaining YouTube formats (per ADDITIONAL_YOUTUBE_PODCAST_CONCEPTS.md)</w:t>
+            </w:r>
+          </w:p>
+        </w:tc>
+        <w:tc>
+          <w:tcPr/>
+          <w:p>
+            <w:pPr>
+              <w:pStyle w:val="Compact"/>
+            </w:pPr>
+            <w:r>
+              <w:t xml:space="preserve">YouTube</w:t>
+            </w:r>
+          </w:p>
+        </w:tc>
+        <w:tc>
+          <w:tcPr/>
+          <w:p>
+            <w:pPr>
+              <w:pStyle w:val="Compact"/>
+            </w:pPr>
+            <w:r>
+              <w:t xml:space="preserve">Post-Phase 6</w:t>
+            </w:r>
+          </w:p>
+        </w:tc>
+        <w:tc>
+          <w:tcPr/>
+          <w:p>
+            <w:pPr>
+              <w:pStyle w:val="Compact"/>
+            </w:pPr>
+            <w:r>
+              <w:t xml:space="preserve">Scale as platform user base justifies production investment</w:t>
+            </w:r>
+          </w:p>
+        </w:tc>
+      </w:tr>
+      <w:tr>
+        <w:tc>
+          <w:tcPr/>
+          <w:p>
+            <w:pPr>
+              <w:pStyle w:val="Compact"/>
+            </w:pPr>
+            <w:r>
+              <w:t xml:space="preserve">Year 3 Q3</w:t>
+            </w:r>
+          </w:p>
+        </w:tc>
+        <w:tc>
+          <w:tcPr/>
+          <w:p>
+            <w:pPr>
+              <w:pStyle w:val="Compact"/>
+            </w:pPr>
+            <w:r>
+              <w:t xml:space="preserve">International format launches (UK, Canada, Australia)</w:t>
+            </w:r>
+          </w:p>
+        </w:tc>
+        <w:tc>
+          <w:tcPr/>
+          <w:p>
+            <w:pPr>
+              <w:pStyle w:val="Compact"/>
+            </w:pPr>
+            <w:r>
+              <w:t xml:space="preserve">TV (International)</w:t>
+            </w:r>
+          </w:p>
+        </w:tc>
+        <w:tc>
+          <w:tcPr/>
+          <w:p>
+            <w:pPr>
+              <w:pStyle w:val="Compact"/>
+            </w:pPr>
+            <w:r>
+              <w:t xml:space="preserve">Post-Phase 6</w:t>
+            </w:r>
+          </w:p>
+        </w:tc>
+        <w:tc>
+          <w:tcPr/>
+          <w:p>
+            <w:pPr>
+              <w:pStyle w:val="Compact"/>
+            </w:pPr>
+            <w:r>
+              <w:t xml:space="preserve">Format proven; international demand established</w:t>
+            </w:r>
+          </w:p>
+        </w:tc>
+      </w:tr>
+      <w:tr>
+        <w:tc>
+          <w:tcPr/>
+          <w:p>
+            <w:pPr>
+              <w:pStyle w:val="Compact"/>
+            </w:pPr>
+            <w:r>
+              <w:t xml:space="preserve">Year 3 Q4</w:t>
+            </w:r>
+          </w:p>
+        </w:tc>
+        <w:tc>
+          <w:tcPr/>
+          <w:p>
+            <w:pPr>
+              <w:pStyle w:val="Compact"/>
+            </w:pPr>
+            <w:r>
+              <w:t xml:space="preserve">Additional podcast concepts per platform data performance</w:t>
+            </w:r>
+          </w:p>
+        </w:tc>
+        <w:tc>
+          <w:tcPr/>
+          <w:p>
+            <w:pPr>
+              <w:pStyle w:val="Compact"/>
+            </w:pPr>
+            <w:r>
+              <w:t xml:space="preserve">Podcast</w:t>
+            </w:r>
+          </w:p>
+        </w:tc>
+        <w:tc>
+          <w:tcPr/>
+          <w:p>
+            <w:pPr>
+              <w:pStyle w:val="Compact"/>
+            </w:pPr>
+            <w:r>
+              <w:t xml:space="preserve">Post-Phase 6</w:t>
+            </w:r>
+          </w:p>
+        </w:tc>
+        <w:tc>
+          <w:tcPr/>
+          <w:p>
+            <w:pPr>
+              <w:pStyle w:val="Compact"/>
+            </w:pPr>
+            <w:r>
+              <w:t xml:space="preserve">Data-driven format expansion</w:t>
+            </w:r>
+          </w:p>
+        </w:tc>
+      </w:tr>
+    </w:tbl>
+    <w:p>
+      <w:pPr>
+        <w:pStyle w:val="BodyText"/>
+      </w:pPr>
+      <w:r>
+        <w:t xml:space="preserve">Note: All launch months are calculated from Q2 2026 funding close. Adjust timeline proportionally if funding close is delayed.</w:t>
+      </w:r>
+    </w:p>
+    <w:p>
+      <w:pPr>
+        <w:pStyle w:val="BodyText"/>
+      </w:pPr>
+      <w:r>
+        <w:rPr>
+          <w:i/>
+          <w:iCs/>
+        </w:rPr>
+        <w:t xml:space="preserve">Review completed: March 20, 2026</w:t>
+      </w:r>
+      <w:r>
+        <w:t xml:space="preserve"> </w:t>
+      </w:r>
+      <w:r>
+        <w:rPr>
+          <w:i/>
+          <w:iCs/>
+        </w:rPr>
+        <w:t xml:space="preserve">Next review recommended: June 20, 2026 (per document’s own schedule) or upon completion of Phase Two (podcast launch)</w:t>
+      </w:r>
+      <w:r>
+        <w:t xml:space="preserve"> </w:t>
+      </w:r>
+      <w:r>
+        <w:rPr>
+          <w:i/>
+          <w:iCs/>
+        </w:rPr>
+        <w:t xml:space="preserve">Reviewed by: Senior Business Analyst, DealStage Strategic Planning</w:t>
+      </w:r>
+    </w:p>
+    <w:bookmarkEnd w:id="44"/>
+    <w:bookmarkEnd w:id="45"/>
     <w:sectPr>
       <w:footnotePr>
         <w:numRestart w:val="eachSect"/>

</xml_diff>